<commit_message>
Add price-target/scenario analysis and refine investment view
</commit_message>
<xml_diff>
--- a/SK_hynix_Equity_Research_2026.docx
+++ b/SK_hynix_Equity_Research_2026.docx
@@ -3515,7 +3515,890 @@
         <w:pStyle w:val="Heading1"/>
       </w:pPr>
       <w:r>
-        <w:t xml:space="preserve">7. Key Risks</w:t>
+        <w:t xml:space="preserve">7. Price Target &amp; Scenario Analysis</w:t>
+      </w:r>
+    </w:p>
+    <w:p>
+      <w:pPr>
+        <w:spacing w:after="120" w:line="276"/>
+      </w:pPr>
+      <w:r>
+        <w:t xml:space="preserve">Because SK hynix's earnings are super-cycle-inflated, a single point target is misleading. We frame value across three through-cycle scenarios, anchored to the early-May 2026 price of ~₩1,686,000. These are illustrative, probability-weighted outcomes — not precise forecasts — and depend chiefly on how long the HBM shortage persists before triopoly capex closes the gap.</w:t>
+      </w:r>
+    </w:p>
+    <w:tbl>
+      <w:tblPr>
+        <w:tblW w:type="dxa" w:w="7400"/>
+        <w:tblBorders>
+          <w:top w:val="single" w:color="auto" w:sz="4"/>
+          <w:left w:val="single" w:color="auto" w:sz="4"/>
+          <w:bottom w:val="single" w:color="auto" w:sz="4"/>
+          <w:right w:val="single" w:color="auto" w:sz="4"/>
+          <w:insideH w:val="single" w:color="auto" w:sz="4"/>
+          <w:insideV w:val="single" w:color="auto" w:sz="4"/>
+        </w:tblBorders>
+      </w:tblPr>
+      <w:tblGrid>
+        <w:gridCol w:w="1700"/>
+        <w:gridCol w:w="1300"/>
+        <w:gridCol w:w="1500"/>
+        <w:gridCol w:w="1500"/>
+        <w:gridCol w:w="1400"/>
+      </w:tblGrid>
+      <w:tr>
+        <w:tc>
+          <w:tcPr>
+            <w:tcW w:type="dxa" w:w="1700"/>
+            <w:tcBorders>
+              <w:top w:val="single" w:color="BFBFBF" w:sz="1"/>
+              <w:left w:val="single" w:color="BFBFBF" w:sz="1"/>
+              <w:bottom w:val="single" w:color="BFBFBF" w:sz="1"/>
+              <w:right w:val="single" w:color="BFBFBF" w:sz="1"/>
+            </w:tcBorders>
+            <w:shd w:fill="1F3864" w:val="clear"/>
+            <w:tcMar>
+              <w:top w:type="dxa" w:w="80"/>
+              <w:left w:type="dxa" w:w="120"/>
+              <w:bottom w:type="dxa" w:w="80"/>
+              <w:right w:type="dxa" w:w="120"/>
+            </w:tcMar>
+          </w:tcPr>
+          <w:p>
+            <w:pPr>
+              <w:jc w:val="left"/>
+            </w:pPr>
+            <w:r>
+              <w:rPr>
+                <w:b/>
+                <w:bCs/>
+                <w:color w:val="FFFFFF"/>
+                <w:sz w:val="20"/>
+                <w:szCs w:val="20"/>
+              </w:rPr>
+              <w:t xml:space="preserve">Scenario</w:t>
+            </w:r>
+          </w:p>
+        </w:tc>
+        <w:tc>
+          <w:tcPr>
+            <w:tcW w:type="dxa" w:w="1300"/>
+            <w:tcBorders>
+              <w:top w:val="single" w:color="BFBFBF" w:sz="1"/>
+              <w:left w:val="single" w:color="BFBFBF" w:sz="1"/>
+              <w:bottom w:val="single" w:color="BFBFBF" w:sz="1"/>
+              <w:right w:val="single" w:color="BFBFBF" w:sz="1"/>
+            </w:tcBorders>
+            <w:shd w:fill="1F3864" w:val="clear"/>
+            <w:tcMar>
+              <w:top w:type="dxa" w:w="80"/>
+              <w:left w:type="dxa" w:w="120"/>
+              <w:bottom w:type="dxa" w:w="80"/>
+              <w:right w:type="dxa" w:w="120"/>
+            </w:tcMar>
+          </w:tcPr>
+          <w:p>
+            <w:pPr>
+              <w:jc w:val="center"/>
+            </w:pPr>
+            <w:r>
+              <w:rPr>
+                <w:b/>
+                <w:bCs/>
+                <w:color w:val="FFFFFF"/>
+                <w:sz w:val="20"/>
+                <w:szCs w:val="20"/>
+              </w:rPr>
+              <w:t xml:space="preserve">Prob.</w:t>
+            </w:r>
+          </w:p>
+        </w:tc>
+        <w:tc>
+          <w:tcPr>
+            <w:tcW w:type="dxa" w:w="1500"/>
+            <w:tcBorders>
+              <w:top w:val="single" w:color="BFBFBF" w:sz="1"/>
+              <w:left w:val="single" w:color="BFBFBF" w:sz="1"/>
+              <w:bottom w:val="single" w:color="BFBFBF" w:sz="1"/>
+              <w:right w:val="single" w:color="BFBFBF" w:sz="1"/>
+            </w:tcBorders>
+            <w:shd w:fill="1F3864" w:val="clear"/>
+            <w:tcMar>
+              <w:top w:type="dxa" w:w="80"/>
+              <w:left w:type="dxa" w:w="120"/>
+              <w:bottom w:type="dxa" w:w="80"/>
+              <w:right w:type="dxa" w:w="120"/>
+            </w:tcMar>
+          </w:tcPr>
+          <w:p>
+            <w:pPr>
+              <w:jc w:val="left"/>
+            </w:pPr>
+            <w:r>
+              <w:rPr>
+                <w:b/>
+                <w:bCs/>
+                <w:color w:val="FFFFFF"/>
+                <w:sz w:val="20"/>
+                <w:szCs w:val="20"/>
+              </w:rPr>
+              <w:t xml:space="preserve">Core assumption</w:t>
+            </w:r>
+          </w:p>
+        </w:tc>
+        <w:tc>
+          <w:tcPr>
+            <w:tcW w:type="dxa" w:w="1500"/>
+            <w:tcBorders>
+              <w:top w:val="single" w:color="BFBFBF" w:sz="1"/>
+              <w:left w:val="single" w:color="BFBFBF" w:sz="1"/>
+              <w:bottom w:val="single" w:color="BFBFBF" w:sz="1"/>
+              <w:right w:val="single" w:color="BFBFBF" w:sz="1"/>
+            </w:tcBorders>
+            <w:shd w:fill="1F3864" w:val="clear"/>
+            <w:tcMar>
+              <w:top w:type="dxa" w:w="80"/>
+              <w:left w:type="dxa" w:w="120"/>
+              <w:bottom w:type="dxa" w:w="80"/>
+              <w:right w:type="dxa" w:w="120"/>
+            </w:tcMar>
+          </w:tcPr>
+          <w:p>
+            <w:pPr>
+              <w:jc w:val="center"/>
+            </w:pPr>
+            <w:r>
+              <w:rPr>
+                <w:b/>
+                <w:bCs/>
+                <w:color w:val="FFFFFF"/>
+                <w:sz w:val="20"/>
+                <w:szCs w:val="20"/>
+              </w:rPr>
+              <w:t xml:space="preserve">12–18m target</w:t>
+            </w:r>
+          </w:p>
+        </w:tc>
+        <w:tc>
+          <w:tcPr>
+            <w:tcW w:type="dxa" w:w="1400"/>
+            <w:tcBorders>
+              <w:top w:val="single" w:color="BFBFBF" w:sz="1"/>
+              <w:left w:val="single" w:color="BFBFBF" w:sz="1"/>
+              <w:bottom w:val="single" w:color="BFBFBF" w:sz="1"/>
+              <w:right w:val="single" w:color="BFBFBF" w:sz="1"/>
+            </w:tcBorders>
+            <w:shd w:fill="1F3864" w:val="clear"/>
+            <w:tcMar>
+              <w:top w:type="dxa" w:w="80"/>
+              <w:left w:type="dxa" w:w="120"/>
+              <w:bottom w:type="dxa" w:w="80"/>
+              <w:right w:type="dxa" w:w="120"/>
+            </w:tcMar>
+          </w:tcPr>
+          <w:p>
+            <w:pPr>
+              <w:jc w:val="center"/>
+            </w:pPr>
+            <w:r>
+              <w:rPr>
+                <w:b/>
+                <w:bCs/>
+                <w:color w:val="FFFFFF"/>
+                <w:sz w:val="20"/>
+                <w:szCs w:val="20"/>
+              </w:rPr>
+              <w:t xml:space="preserve">vs spot</w:t>
+            </w:r>
+          </w:p>
+        </w:tc>
+      </w:tr>
+      <w:tr>
+        <w:tc>
+          <w:tcPr>
+            <w:tcW w:type="dxa" w:w="1700"/>
+            <w:tcBorders>
+              <w:top w:val="single" w:color="BFBFBF" w:sz="1"/>
+              <w:left w:val="single" w:color="BFBFBF" w:sz="1"/>
+              <w:bottom w:val="single" w:color="BFBFBF" w:sz="1"/>
+              <w:right w:val="single" w:color="BFBFBF" w:sz="1"/>
+            </w:tcBorders>
+            <w:shd w:fill="FFFFFF" w:val="clear"/>
+            <w:tcMar>
+              <w:top w:type="dxa" w:w="80"/>
+              <w:left w:type="dxa" w:w="120"/>
+              <w:bottom w:type="dxa" w:w="80"/>
+              <w:right w:type="dxa" w:w="120"/>
+            </w:tcMar>
+          </w:tcPr>
+          <w:p>
+            <w:pPr>
+              <w:jc w:val="left"/>
+            </w:pPr>
+            <w:r>
+              <w:rPr>
+                <w:b w:val="false"/>
+                <w:bCs w:val="false"/>
+                <w:color w:val="000000"/>
+                <w:sz w:val="20"/>
+                <w:szCs w:val="20"/>
+              </w:rPr>
+              <w:t xml:space="preserve">Bull</w:t>
+            </w:r>
+          </w:p>
+        </w:tc>
+        <w:tc>
+          <w:tcPr>
+            <w:tcW w:type="dxa" w:w="1300"/>
+            <w:tcBorders>
+              <w:top w:val="single" w:color="BFBFBF" w:sz="1"/>
+              <w:left w:val="single" w:color="BFBFBF" w:sz="1"/>
+              <w:bottom w:val="single" w:color="BFBFBF" w:sz="1"/>
+              <w:right w:val="single" w:color="BFBFBF" w:sz="1"/>
+            </w:tcBorders>
+            <w:shd w:fill="FFFFFF" w:val="clear"/>
+            <w:tcMar>
+              <w:top w:type="dxa" w:w="80"/>
+              <w:left w:type="dxa" w:w="120"/>
+              <w:bottom w:type="dxa" w:w="80"/>
+              <w:right w:type="dxa" w:w="120"/>
+            </w:tcMar>
+          </w:tcPr>
+          <w:p>
+            <w:pPr>
+              <w:jc w:val="center"/>
+            </w:pPr>
+            <w:r>
+              <w:rPr>
+                <w:b w:val="false"/>
+                <w:bCs w:val="false"/>
+                <w:color w:val="000000"/>
+                <w:sz w:val="20"/>
+                <w:szCs w:val="20"/>
+              </w:rPr>
+              <w:t xml:space="preserve">35%</w:t>
+            </w:r>
+          </w:p>
+        </w:tc>
+        <w:tc>
+          <w:tcPr>
+            <w:tcW w:type="dxa" w:w="1500"/>
+            <w:tcBorders>
+              <w:top w:val="single" w:color="BFBFBF" w:sz="1"/>
+              <w:left w:val="single" w:color="BFBFBF" w:sz="1"/>
+              <w:bottom w:val="single" w:color="BFBFBF" w:sz="1"/>
+              <w:right w:val="single" w:color="BFBFBF" w:sz="1"/>
+            </w:tcBorders>
+            <w:shd w:fill="FFFFFF" w:val="clear"/>
+            <w:tcMar>
+              <w:top w:type="dxa" w:w="80"/>
+              <w:left w:type="dxa" w:w="120"/>
+              <w:bottom w:type="dxa" w:w="80"/>
+              <w:right w:type="dxa" w:w="120"/>
+            </w:tcMar>
+          </w:tcPr>
+          <w:p>
+            <w:pPr>
+              <w:jc w:val="left"/>
+            </w:pPr>
+            <w:r>
+              <w:rPr>
+                <w:b w:val="false"/>
+                <w:bCs w:val="false"/>
+                <w:color w:val="000000"/>
+                <w:sz w:val="20"/>
+                <w:szCs w:val="20"/>
+              </w:rPr>
+              <w:t xml:space="preserve">Structural HBM shortage to 2030; margins hold</w:t>
+            </w:r>
+          </w:p>
+        </w:tc>
+        <w:tc>
+          <w:tcPr>
+            <w:tcW w:type="dxa" w:w="1500"/>
+            <w:tcBorders>
+              <w:top w:val="single" w:color="BFBFBF" w:sz="1"/>
+              <w:left w:val="single" w:color="BFBFBF" w:sz="1"/>
+              <w:bottom w:val="single" w:color="BFBFBF" w:sz="1"/>
+              <w:right w:val="single" w:color="BFBFBF" w:sz="1"/>
+            </w:tcBorders>
+            <w:shd w:fill="FFFFFF" w:val="clear"/>
+            <w:tcMar>
+              <w:top w:type="dxa" w:w="80"/>
+              <w:left w:type="dxa" w:w="120"/>
+              <w:bottom w:type="dxa" w:w="80"/>
+              <w:right w:type="dxa" w:w="120"/>
+            </w:tcMar>
+          </w:tcPr>
+          <w:p>
+            <w:pPr>
+              <w:jc w:val="right"/>
+            </w:pPr>
+            <w:r>
+              <w:rPr>
+                <w:b/>
+                <w:bCs/>
+                <w:color w:val="000000"/>
+                <w:sz w:val="20"/>
+                <w:szCs w:val="20"/>
+              </w:rPr>
+              <w:t xml:space="preserve">₩2,400,000</w:t>
+            </w:r>
+          </w:p>
+        </w:tc>
+        <w:tc>
+          <w:tcPr>
+            <w:tcW w:type="dxa" w:w="1400"/>
+            <w:tcBorders>
+              <w:top w:val="single" w:color="BFBFBF" w:sz="1"/>
+              <w:left w:val="single" w:color="BFBFBF" w:sz="1"/>
+              <w:bottom w:val="single" w:color="BFBFBF" w:sz="1"/>
+              <w:right w:val="single" w:color="BFBFBF" w:sz="1"/>
+            </w:tcBorders>
+            <w:shd w:fill="FFFFFF" w:val="clear"/>
+            <w:tcMar>
+              <w:top w:type="dxa" w:w="80"/>
+              <w:left w:type="dxa" w:w="120"/>
+              <w:bottom w:type="dxa" w:w="80"/>
+              <w:right w:type="dxa" w:w="120"/>
+            </w:tcMar>
+          </w:tcPr>
+          <w:p>
+            <w:pPr>
+              <w:jc w:val="right"/>
+            </w:pPr>
+            <w:r>
+              <w:rPr>
+                <w:b/>
+                <w:bCs/>
+                <w:color w:val="2E7D32"/>
+                <w:sz w:val="20"/>
+                <w:szCs w:val="20"/>
+              </w:rPr>
+              <w:t xml:space="preserve">+42%</w:t>
+            </w:r>
+          </w:p>
+        </w:tc>
+      </w:tr>
+      <w:tr>
+        <w:tc>
+          <w:tcPr>
+            <w:tcW w:type="dxa" w:w="1700"/>
+            <w:tcBorders>
+              <w:top w:val="single" w:color="BFBFBF" w:sz="1"/>
+              <w:left w:val="single" w:color="BFBFBF" w:sz="1"/>
+              <w:bottom w:val="single" w:color="BFBFBF" w:sz="1"/>
+              <w:right w:val="single" w:color="BFBFBF" w:sz="1"/>
+            </w:tcBorders>
+            <w:shd w:fill="FFFFFF" w:val="clear"/>
+            <w:tcMar>
+              <w:top w:type="dxa" w:w="80"/>
+              <w:left w:type="dxa" w:w="120"/>
+              <w:bottom w:type="dxa" w:w="80"/>
+              <w:right w:type="dxa" w:w="120"/>
+            </w:tcMar>
+          </w:tcPr>
+          <w:p>
+            <w:pPr>
+              <w:jc w:val="left"/>
+            </w:pPr>
+            <w:r>
+              <w:rPr>
+                <w:b w:val="false"/>
+                <w:bCs w:val="false"/>
+                <w:color w:val="000000"/>
+                <w:sz w:val="20"/>
+                <w:szCs w:val="20"/>
+              </w:rPr>
+              <w:t xml:space="preserve">Base</w:t>
+            </w:r>
+          </w:p>
+        </w:tc>
+        <w:tc>
+          <w:tcPr>
+            <w:tcW w:type="dxa" w:w="1300"/>
+            <w:tcBorders>
+              <w:top w:val="single" w:color="BFBFBF" w:sz="1"/>
+              <w:left w:val="single" w:color="BFBFBF" w:sz="1"/>
+              <w:bottom w:val="single" w:color="BFBFBF" w:sz="1"/>
+              <w:right w:val="single" w:color="BFBFBF" w:sz="1"/>
+            </w:tcBorders>
+            <w:shd w:fill="FFFFFF" w:val="clear"/>
+            <w:tcMar>
+              <w:top w:type="dxa" w:w="80"/>
+              <w:left w:type="dxa" w:w="120"/>
+              <w:bottom w:type="dxa" w:w="80"/>
+              <w:right w:type="dxa" w:w="120"/>
+            </w:tcMar>
+          </w:tcPr>
+          <w:p>
+            <w:pPr>
+              <w:jc w:val="center"/>
+            </w:pPr>
+            <w:r>
+              <w:rPr>
+                <w:b w:val="false"/>
+                <w:bCs w:val="false"/>
+                <w:color w:val="000000"/>
+                <w:sz w:val="20"/>
+                <w:szCs w:val="20"/>
+              </w:rPr>
+              <w:t xml:space="preserve">40%</w:t>
+            </w:r>
+          </w:p>
+        </w:tc>
+        <w:tc>
+          <w:tcPr>
+            <w:tcW w:type="dxa" w:w="1500"/>
+            <w:tcBorders>
+              <w:top w:val="single" w:color="BFBFBF" w:sz="1"/>
+              <w:left w:val="single" w:color="BFBFBF" w:sz="1"/>
+              <w:bottom w:val="single" w:color="BFBFBF" w:sz="1"/>
+              <w:right w:val="single" w:color="BFBFBF" w:sz="1"/>
+            </w:tcBorders>
+            <w:shd w:fill="FFFFFF" w:val="clear"/>
+            <w:tcMar>
+              <w:top w:type="dxa" w:w="80"/>
+              <w:left w:type="dxa" w:w="120"/>
+              <w:bottom w:type="dxa" w:w="80"/>
+              <w:right w:type="dxa" w:w="120"/>
+            </w:tcMar>
+          </w:tcPr>
+          <w:p>
+            <w:pPr>
+              <w:jc w:val="left"/>
+            </w:pPr>
+            <w:r>
+              <w:rPr>
+                <w:b w:val="false"/>
+                <w:bCs w:val="false"/>
+                <w:color w:val="000000"/>
+                <w:sz w:val="20"/>
+                <w:szCs w:val="20"/>
+              </w:rPr>
+              <w:t xml:space="preserve">HBM premium persists; margins ease to mid-cycle</w:t>
+            </w:r>
+          </w:p>
+        </w:tc>
+        <w:tc>
+          <w:tcPr>
+            <w:tcW w:type="dxa" w:w="1500"/>
+            <w:tcBorders>
+              <w:top w:val="single" w:color="BFBFBF" w:sz="1"/>
+              <w:left w:val="single" w:color="BFBFBF" w:sz="1"/>
+              <w:bottom w:val="single" w:color="BFBFBF" w:sz="1"/>
+              <w:right w:val="single" w:color="BFBFBF" w:sz="1"/>
+            </w:tcBorders>
+            <w:shd w:fill="FFFFFF" w:val="clear"/>
+            <w:tcMar>
+              <w:top w:type="dxa" w:w="80"/>
+              <w:left w:type="dxa" w:w="120"/>
+              <w:bottom w:type="dxa" w:w="80"/>
+              <w:right w:type="dxa" w:w="120"/>
+            </w:tcMar>
+          </w:tcPr>
+          <w:p>
+            <w:pPr>
+              <w:jc w:val="right"/>
+            </w:pPr>
+            <w:r>
+              <w:rPr>
+                <w:b/>
+                <w:bCs/>
+                <w:color w:val="000000"/>
+                <w:sz w:val="20"/>
+                <w:szCs w:val="20"/>
+              </w:rPr>
+              <w:t xml:space="preserve">₩1,900,000</w:t>
+            </w:r>
+          </w:p>
+        </w:tc>
+        <w:tc>
+          <w:tcPr>
+            <w:tcW w:type="dxa" w:w="1400"/>
+            <w:tcBorders>
+              <w:top w:val="single" w:color="BFBFBF" w:sz="1"/>
+              <w:left w:val="single" w:color="BFBFBF" w:sz="1"/>
+              <w:bottom w:val="single" w:color="BFBFBF" w:sz="1"/>
+              <w:right w:val="single" w:color="BFBFBF" w:sz="1"/>
+            </w:tcBorders>
+            <w:shd w:fill="FFFFFF" w:val="clear"/>
+            <w:tcMar>
+              <w:top w:type="dxa" w:w="80"/>
+              <w:left w:type="dxa" w:w="120"/>
+              <w:bottom w:type="dxa" w:w="80"/>
+              <w:right w:type="dxa" w:w="120"/>
+            </w:tcMar>
+          </w:tcPr>
+          <w:p>
+            <w:pPr>
+              <w:jc w:val="right"/>
+            </w:pPr>
+            <w:r>
+              <w:rPr>
+                <w:b w:val="false"/>
+                <w:bCs w:val="false"/>
+                <w:color w:val="2E7D32"/>
+                <w:sz w:val="20"/>
+                <w:szCs w:val="20"/>
+              </w:rPr>
+              <w:t xml:space="preserve">+13%</w:t>
+            </w:r>
+          </w:p>
+        </w:tc>
+      </w:tr>
+      <w:tr>
+        <w:tc>
+          <w:tcPr>
+            <w:tcW w:type="dxa" w:w="1700"/>
+            <w:tcBorders>
+              <w:top w:val="single" w:color="BFBFBF" w:sz="1"/>
+              <w:left w:val="single" w:color="BFBFBF" w:sz="1"/>
+              <w:bottom w:val="single" w:color="BFBFBF" w:sz="1"/>
+              <w:right w:val="single" w:color="BFBFBF" w:sz="1"/>
+            </w:tcBorders>
+            <w:shd w:fill="FFFFFF" w:val="clear"/>
+            <w:tcMar>
+              <w:top w:type="dxa" w:w="80"/>
+              <w:left w:type="dxa" w:w="120"/>
+              <w:bottom w:type="dxa" w:w="80"/>
+              <w:right w:type="dxa" w:w="120"/>
+            </w:tcMar>
+          </w:tcPr>
+          <w:p>
+            <w:pPr>
+              <w:jc w:val="left"/>
+            </w:pPr>
+            <w:r>
+              <w:rPr>
+                <w:b w:val="false"/>
+                <w:bCs w:val="false"/>
+                <w:color w:val="000000"/>
+                <w:sz w:val="20"/>
+                <w:szCs w:val="20"/>
+              </w:rPr>
+              <w:t xml:space="preserve">Bear</w:t>
+            </w:r>
+          </w:p>
+        </w:tc>
+        <w:tc>
+          <w:tcPr>
+            <w:tcW w:type="dxa" w:w="1300"/>
+            <w:tcBorders>
+              <w:top w:val="single" w:color="BFBFBF" w:sz="1"/>
+              <w:left w:val="single" w:color="BFBFBF" w:sz="1"/>
+              <w:bottom w:val="single" w:color="BFBFBF" w:sz="1"/>
+              <w:right w:val="single" w:color="BFBFBF" w:sz="1"/>
+            </w:tcBorders>
+            <w:shd w:fill="FFFFFF" w:val="clear"/>
+            <w:tcMar>
+              <w:top w:type="dxa" w:w="80"/>
+              <w:left w:type="dxa" w:w="120"/>
+              <w:bottom w:type="dxa" w:w="80"/>
+              <w:right w:type="dxa" w:w="120"/>
+            </w:tcMar>
+          </w:tcPr>
+          <w:p>
+            <w:pPr>
+              <w:jc w:val="center"/>
+            </w:pPr>
+            <w:r>
+              <w:rPr>
+                <w:b w:val="false"/>
+                <w:bCs w:val="false"/>
+                <w:color w:val="000000"/>
+                <w:sz w:val="20"/>
+                <w:szCs w:val="20"/>
+              </w:rPr>
+              <w:t xml:space="preserve">25%</w:t>
+            </w:r>
+          </w:p>
+        </w:tc>
+        <w:tc>
+          <w:tcPr>
+            <w:tcW w:type="dxa" w:w="1500"/>
+            <w:tcBorders>
+              <w:top w:val="single" w:color="BFBFBF" w:sz="1"/>
+              <w:left w:val="single" w:color="BFBFBF" w:sz="1"/>
+              <w:bottom w:val="single" w:color="BFBFBF" w:sz="1"/>
+              <w:right w:val="single" w:color="BFBFBF" w:sz="1"/>
+            </w:tcBorders>
+            <w:shd w:fill="FFFFFF" w:val="clear"/>
+            <w:tcMar>
+              <w:top w:type="dxa" w:w="80"/>
+              <w:left w:type="dxa" w:w="120"/>
+              <w:bottom w:type="dxa" w:w="80"/>
+              <w:right w:type="dxa" w:w="120"/>
+            </w:tcMar>
+          </w:tcPr>
+          <w:p>
+            <w:pPr>
+              <w:jc w:val="left"/>
+            </w:pPr>
+            <w:r>
+              <w:rPr>
+                <w:b w:val="false"/>
+                <w:bCs w:val="false"/>
+                <w:color w:val="000000"/>
+                <w:sz w:val="20"/>
+                <w:szCs w:val="20"/>
+              </w:rPr>
+              <w:t xml:space="preserve">Cycle rolls over; capacity catches demand</w:t>
+            </w:r>
+          </w:p>
+        </w:tc>
+        <w:tc>
+          <w:tcPr>
+            <w:tcW w:type="dxa" w:w="1500"/>
+            <w:tcBorders>
+              <w:top w:val="single" w:color="BFBFBF" w:sz="1"/>
+              <w:left w:val="single" w:color="BFBFBF" w:sz="1"/>
+              <w:bottom w:val="single" w:color="BFBFBF" w:sz="1"/>
+              <w:right w:val="single" w:color="BFBFBF" w:sz="1"/>
+            </w:tcBorders>
+            <w:shd w:fill="FFFFFF" w:val="clear"/>
+            <w:tcMar>
+              <w:top w:type="dxa" w:w="80"/>
+              <w:left w:type="dxa" w:w="120"/>
+              <w:bottom w:type="dxa" w:w="80"/>
+              <w:right w:type="dxa" w:w="120"/>
+            </w:tcMar>
+          </w:tcPr>
+          <w:p>
+            <w:pPr>
+              <w:jc w:val="right"/>
+            </w:pPr>
+            <w:r>
+              <w:rPr>
+                <w:b/>
+                <w:bCs/>
+                <w:color w:val="000000"/>
+                <w:sz w:val="20"/>
+                <w:szCs w:val="20"/>
+              </w:rPr>
+              <w:t xml:space="preserve">₩1,100,000</w:t>
+            </w:r>
+          </w:p>
+        </w:tc>
+        <w:tc>
+          <w:tcPr>
+            <w:tcW w:type="dxa" w:w="1400"/>
+            <w:tcBorders>
+              <w:top w:val="single" w:color="BFBFBF" w:sz="1"/>
+              <w:left w:val="single" w:color="BFBFBF" w:sz="1"/>
+              <w:bottom w:val="single" w:color="BFBFBF" w:sz="1"/>
+              <w:right w:val="single" w:color="BFBFBF" w:sz="1"/>
+            </w:tcBorders>
+            <w:shd w:fill="FFFFFF" w:val="clear"/>
+            <w:tcMar>
+              <w:top w:type="dxa" w:w="80"/>
+              <w:left w:type="dxa" w:w="120"/>
+              <w:bottom w:type="dxa" w:w="80"/>
+              <w:right w:type="dxa" w:w="120"/>
+            </w:tcMar>
+          </w:tcPr>
+          <w:p>
+            <w:pPr>
+              <w:jc w:val="right"/>
+            </w:pPr>
+            <w:r>
+              <w:rPr>
+                <w:b/>
+                <w:bCs/>
+                <w:color w:val="B00020"/>
+                <w:sz w:val="20"/>
+                <w:szCs w:val="20"/>
+              </w:rPr>
+              <w:t xml:space="preserve">-35%</w:t>
+            </w:r>
+          </w:p>
+        </w:tc>
+      </w:tr>
+      <w:tr>
+        <w:tc>
+          <w:tcPr>
+            <w:tcW w:type="dxa" w:w="1700"/>
+            <w:tcBorders>
+              <w:top w:val="single" w:color="BFBFBF" w:sz="1"/>
+              <w:left w:val="single" w:color="BFBFBF" w:sz="1"/>
+              <w:bottom w:val="single" w:color="BFBFBF" w:sz="1"/>
+              <w:right w:val="single" w:color="BFBFBF" w:sz="1"/>
+            </w:tcBorders>
+            <w:shd w:fill="D9E2F3" w:val="clear"/>
+            <w:tcMar>
+              <w:top w:type="dxa" w:w="80"/>
+              <w:left w:type="dxa" w:w="120"/>
+              <w:bottom w:type="dxa" w:w="80"/>
+              <w:right w:type="dxa" w:w="120"/>
+            </w:tcMar>
+          </w:tcPr>
+          <w:p>
+            <w:pPr>
+              <w:jc w:val="left"/>
+            </w:pPr>
+            <w:r>
+              <w:rPr>
+                <w:b/>
+                <w:bCs/>
+                <w:color w:val="000000"/>
+                <w:sz w:val="20"/>
+                <w:szCs w:val="20"/>
+              </w:rPr>
+              <w:t xml:space="preserve">Weighted</w:t>
+            </w:r>
+          </w:p>
+        </w:tc>
+        <w:tc>
+          <w:tcPr>
+            <w:tcW w:type="dxa" w:w="1300"/>
+            <w:tcBorders>
+              <w:top w:val="single" w:color="BFBFBF" w:sz="1"/>
+              <w:left w:val="single" w:color="BFBFBF" w:sz="1"/>
+              <w:bottom w:val="single" w:color="BFBFBF" w:sz="1"/>
+              <w:right w:val="single" w:color="BFBFBF" w:sz="1"/>
+            </w:tcBorders>
+            <w:shd w:fill="D9E2F3" w:val="clear"/>
+            <w:tcMar>
+              <w:top w:type="dxa" w:w="80"/>
+              <w:left w:type="dxa" w:w="120"/>
+              <w:bottom w:type="dxa" w:w="80"/>
+              <w:right w:type="dxa" w:w="120"/>
+            </w:tcMar>
+          </w:tcPr>
+          <w:p>
+            <w:pPr>
+              <w:jc w:val="center"/>
+            </w:pPr>
+            <w:r>
+              <w:rPr>
+                <w:b/>
+                <w:bCs/>
+                <w:color w:val="000000"/>
+                <w:sz w:val="20"/>
+                <w:szCs w:val="20"/>
+              </w:rPr>
+              <w:t xml:space="preserve">100%</w:t>
+            </w:r>
+          </w:p>
+        </w:tc>
+        <w:tc>
+          <w:tcPr>
+            <w:tcW w:type="dxa" w:w="1500"/>
+            <w:tcBorders>
+              <w:top w:val="single" w:color="BFBFBF" w:sz="1"/>
+              <w:left w:val="single" w:color="BFBFBF" w:sz="1"/>
+              <w:bottom w:val="single" w:color="BFBFBF" w:sz="1"/>
+              <w:right w:val="single" w:color="BFBFBF" w:sz="1"/>
+            </w:tcBorders>
+            <w:shd w:fill="D9E2F3" w:val="clear"/>
+            <w:tcMar>
+              <w:top w:type="dxa" w:w="80"/>
+              <w:left w:type="dxa" w:w="120"/>
+              <w:bottom w:type="dxa" w:w="80"/>
+              <w:right w:type="dxa" w:w="120"/>
+            </w:tcMar>
+          </w:tcPr>
+          <w:p>
+            <w:pPr>
+              <w:jc w:val="left"/>
+            </w:pPr>
+            <w:r>
+              <w:rPr>
+                <w:b/>
+                <w:bCs/>
+                <w:color w:val="000000"/>
+                <w:sz w:val="20"/>
+                <w:szCs w:val="20"/>
+              </w:rPr>
+              <w:t xml:space="preserve">Probability-weighted expected value</w:t>
+            </w:r>
+          </w:p>
+        </w:tc>
+        <w:tc>
+          <w:tcPr>
+            <w:tcW w:type="dxa" w:w="1500"/>
+            <w:tcBorders>
+              <w:top w:val="single" w:color="BFBFBF" w:sz="1"/>
+              <w:left w:val="single" w:color="BFBFBF" w:sz="1"/>
+              <w:bottom w:val="single" w:color="BFBFBF" w:sz="1"/>
+              <w:right w:val="single" w:color="BFBFBF" w:sz="1"/>
+            </w:tcBorders>
+            <w:shd w:fill="D9E2F3" w:val="clear"/>
+            <w:tcMar>
+              <w:top w:type="dxa" w:w="80"/>
+              <w:left w:type="dxa" w:w="120"/>
+              <w:bottom w:type="dxa" w:w="80"/>
+              <w:right w:type="dxa" w:w="120"/>
+            </w:tcMar>
+          </w:tcPr>
+          <w:p>
+            <w:pPr>
+              <w:jc w:val="right"/>
+            </w:pPr>
+            <w:r>
+              <w:rPr>
+                <w:b/>
+                <w:bCs/>
+                <w:color w:val="000000"/>
+                <w:sz w:val="20"/>
+                <w:szCs w:val="20"/>
+              </w:rPr>
+              <w:t xml:space="preserve">₩1,875,000</w:t>
+            </w:r>
+          </w:p>
+        </w:tc>
+        <w:tc>
+          <w:tcPr>
+            <w:tcW w:type="dxa" w:w="1400"/>
+            <w:tcBorders>
+              <w:top w:val="single" w:color="BFBFBF" w:sz="1"/>
+              <w:left w:val="single" w:color="BFBFBF" w:sz="1"/>
+              <w:bottom w:val="single" w:color="BFBFBF" w:sz="1"/>
+              <w:right w:val="single" w:color="BFBFBF" w:sz="1"/>
+            </w:tcBorders>
+            <w:shd w:fill="D9E2F3" w:val="clear"/>
+            <w:tcMar>
+              <w:top w:type="dxa" w:w="80"/>
+              <w:left w:type="dxa" w:w="120"/>
+              <w:bottom w:type="dxa" w:w="80"/>
+              <w:right w:type="dxa" w:w="120"/>
+            </w:tcMar>
+          </w:tcPr>
+          <w:p>
+            <w:pPr>
+              <w:jc w:val="right"/>
+            </w:pPr>
+            <w:r>
+              <w:rPr>
+                <w:b/>
+                <w:bCs/>
+                <w:color w:val="000000"/>
+                <w:sz w:val="20"/>
+                <w:szCs w:val="20"/>
+              </w:rPr>
+              <w:t xml:space="preserve">+11%</w:t>
+            </w:r>
+          </w:p>
+        </w:tc>
+      </w:tr>
+    </w:tbl>
+    <w:p>
+      <w:pPr>
+        <w:spacing w:after="120" w:line="276"/>
+      </w:pPr>
+      <w:r>
+        <w:t xml:space="preserve"/>
+      </w:r>
+    </w:p>
+    <w:p>
+      <w:pPr>
+        <w:spacing w:after="120" w:line="276"/>
+      </w:pPr>
+      <w:r>
+        <w:rPr>
+          <w:i/>
+          <w:iCs/>
+        </w:rPr>
+        <w:t xml:space="preserve">The asymmetry is the point: the probability-weighted target sits only ~11% above spot, yet the bear case implies a ~35% drawdown. After a ~250% YTD run, the distribution of outcomes is skewed — modest expected upside against a fat left tail. The bull case is credible but requires the shortage to outlast three well-funded expanders; the bear case requires only that memory behave the way memory has always behaved.</w:t>
       </w:r>
     </w:p>
     <w:p>
@@ -3532,10 +4415,10 @@
           <w:b/>
           <w:bCs/>
         </w:rPr>
-        <w:t xml:space="preserve">Cyclicality: </w:t>
-      </w:r>
-      <w:r>
-        <w:t xml:space="preserve">Memory is the most cyclical major tech sub-sector. The current shortage will eventually be met by industry-wide capacity additions, and pricing can reverse sharply.</w:t>
+        <w:t xml:space="preserve">Bull triggers: </w:t>
+      </w:r>
+      <w:r>
+        <w:t xml:space="preserve">HBM4E qualified ahead of peers; Nvidia Rubin volumes exceed plan; 2027 supply still sold out; conventional DRAM stays tight.</w:t>
       </w:r>
     </w:p>
     <w:p>
@@ -3552,10 +4435,29 @@
           <w:b/>
           <w:bCs/>
         </w:rPr>
-        <w:t xml:space="preserve">Self-inflicted supply: </w:t>
-      </w:r>
-      <w:r>
-        <w:t xml:space="preserve">SK hynix, Samsung and Micron are collectively spending tens of billions to expand HBM — the cure for the very shortage driving today's margins.</w:t>
+        <w:t xml:space="preserve">Bear triggers: </w:t>
+      </w:r>
+      <w:r>
+        <w:t xml:space="preserve">Samsung/Micron close the Nvidia qualification gap; AI-capex growth decelerates; combined 2026–27 capex visibly outruns demand; HBM spot pricing rolls over.</w:t>
+      </w:r>
+    </w:p>
+    <w:p>
+      <w:pPr>
+        <w:pBdr>
+          <w:bottom w:val="single" w:color="2E75B6" w:sz="6" w:space="1"/>
+        </w:pBdr>
+        <w:spacing w:after="120"/>
+      </w:pPr>
+      <w:r>
+        <w:t xml:space="preserve"/>
+      </w:r>
+    </w:p>
+    <w:p>
+      <w:pPr>
+        <w:pStyle w:val="Heading1"/>
+      </w:pPr>
+      <w:r>
+        <w:t xml:space="preserve">8. Key Risks</w:t>
       </w:r>
     </w:p>
     <w:p>
@@ -3572,10 +4474,10 @@
           <w:b/>
           <w:bCs/>
         </w:rPr>
-        <w:t xml:space="preserve">Customer concentration: </w:t>
-      </w:r>
-      <w:r>
-        <w:t xml:space="preserve">Heavy dependence on Nvidia and the AI accelerator roadmap. Any slowdown in AI capex, or an architecture that needs less memory, hits the core thesis.</w:t>
+        <w:t xml:space="preserve">Cyclicality: </w:t>
+      </w:r>
+      <w:r>
+        <w:t xml:space="preserve">Memory is the most cyclical major tech sub-sector. The current shortage will eventually be met by industry-wide capacity additions, and pricing can reverse sharply.</w:t>
       </w:r>
     </w:p>
     <w:p>
@@ -3592,10 +4494,10 @@
           <w:b/>
           <w:bCs/>
         </w:rPr>
-        <w:t xml:space="preserve">Competitive catch-up: </w:t>
-      </w:r>
-      <w:r>
-        <w:t xml:space="preserve">Samsung's HBM4 (1c-nm, in-house base die) and Micron's ramp could erode SK hynix's share and pricing as qualification gaps close.</w:t>
+        <w:t xml:space="preserve">Self-inflicted supply: </w:t>
+      </w:r>
+      <w:r>
+        <w:t xml:space="preserve">SK hynix, Samsung and Micron are collectively spending tens of billions to expand HBM — the cure for the very shortage driving today's margins.</w:t>
       </w:r>
     </w:p>
     <w:p>
@@ -3612,10 +4514,10 @@
           <w:b/>
           <w:bCs/>
         </w:rPr>
-        <w:t xml:space="preserve">Execution / yield: </w:t>
-      </w:r>
-      <w:r>
-        <w:t xml:space="preserve">HBM4 hybrid-bonding and advanced packaging carry real yield risk at nanometre scale; stumbles would be costly given the capacity commitments.</w:t>
+        <w:t xml:space="preserve">Customer concentration: </w:t>
+      </w:r>
+      <w:r>
+        <w:t xml:space="preserve">Heavy dependence on Nvidia and the AI accelerator roadmap. Any slowdown in AI capex, or an architecture that needs less memory, hits the core thesis.</w:t>
       </w:r>
     </w:p>
     <w:p>
@@ -3632,6 +4534,46 @@
           <w:b/>
           <w:bCs/>
         </w:rPr>
+        <w:t xml:space="preserve">Competitive catch-up: </w:t>
+      </w:r>
+      <w:r>
+        <w:t xml:space="preserve">Samsung's HBM4 (1c-nm, in-house base die) and Micron's ramp could erode SK hynix's share and pricing as qualification gaps close.</w:t>
+      </w:r>
+    </w:p>
+    <w:p>
+      <w:pPr>
+        <w:pStyle w:val="ListParagraph"/>
+        <w:numPr>
+          <w:ilvl w:val="0"/>
+          <w:numId w:val="2"/>
+        </w:numPr>
+        <w:spacing w:after="60" w:line="276"/>
+      </w:pPr>
+      <w:r>
+        <w:rPr>
+          <w:b/>
+          <w:bCs/>
+        </w:rPr>
+        <w:t xml:space="preserve">Execution / yield: </w:t>
+      </w:r>
+      <w:r>
+        <w:t xml:space="preserve">HBM4 hybrid-bonding and advanced packaging carry real yield risk at nanometre scale; stumbles would be costly given the capacity commitments.</w:t>
+      </w:r>
+    </w:p>
+    <w:p>
+      <w:pPr>
+        <w:pStyle w:val="ListParagraph"/>
+        <w:numPr>
+          <w:ilvl w:val="0"/>
+          <w:numId w:val="2"/>
+        </w:numPr>
+        <w:spacing w:after="60" w:line="276"/>
+      </w:pPr>
+      <w:r>
+        <w:rPr>
+          <w:b/>
+          <w:bCs/>
+        </w:rPr>
         <w:t xml:space="preserve">Macro &amp; geopolitical: </w:t>
       </w:r>
       <w:r>
@@ -3654,7 +4596,7 @@
         <w:pStyle w:val="Heading1"/>
       </w:pPr>
       <w:r>
-        <w:t xml:space="preserve">8. Investment View</w:t>
+        <w:t xml:space="preserve">9. Investment View</w:t>
       </w:r>
     </w:p>
     <w:p>
@@ -3671,6 +4613,14 @@
       </w:pPr>
       <w:r>
         <w:t xml:space="preserve">But the security is still, at root, a cyclical commodity producer enjoying an exceptional — and partly self-correcting — shortage. The 72% margin is a peak signal, not a baseline. The investment decision therefore reduces to a single question: how long does the HBM shortage persist before the triopoly's combined capex closes the gap? Bulls see a multi-year structural shortage into 2030; bears see the seeds of the next down-cycle already in the ground.</w:t>
+      </w:r>
+    </w:p>
+    <w:p>
+      <w:pPr>
+        <w:spacing w:after="120" w:line="276"/>
+      </w:pPr>
+      <w:r>
+        <w:t xml:space="preserve">Our probability-weighted scenario work (Section 7) puts fair value around ₩1,875,000 — roughly 11% above the early-May 2026 price — against a bear-case drawdown near 35%. That is positive but modest expected value with a materially fat left tail. The implication is not 'avoid', but 'size and time with discipline': this is a position to scale into on cyclical weakness rather than to chase after a ~250% run.</w:t>
       </w:r>
     </w:p>
     <w:p>

</xml_diff>